<commit_message>
Document HR cockpit feature list
</commit_message>
<xml_diff>
--- a/TrafagSalesExporter/docs/HR_KPI_ANLEITUNG_HR_2026-05-20.docx
+++ b/TrafagSalesExporter/docs/HR_KPI_ANLEITUNG_HR_2026-05-20.docx
@@ -3,11 +3,8 @@
 <w:document xmlns:w="http://schemas.openxmlformats.org/wordprocessingml/2006/main">
   <w:body>
     <w:p>
-      <w:pPr>
-        <w:pStyle w:val="Title"/>
-      </w:pPr>
-      <w:r>
-        <w:t>HR-KPI Cockpit Anleitung fuer HR</w:t>
+      <w:r>
+        <w:t xml:space="preserve">HR-KPI Cockpit Anleitung fuer HR</w:t>
       </w:r>
     </w:p>
     <w:p>
@@ -15,13 +12,9 @@
         <w:t xml:space="preserve">Stand: 2026-05-20</w:t>
       </w:r>
     </w:p>
-    <w:p/>
-    <w:p>
-      <w:pPr>
-        <w:pStyle w:val="Heading1"/>
-      </w:pPr>
-      <w:r>
-        <w:t>Ziel</w:t>
+    <w:p>
+      <w:r>
+        <w:t xml:space="preserve">Ziel</w:t>
       </w:r>
     </w:p>
     <w:p>
@@ -29,13 +22,9 @@
         <w:t xml:space="preserve">Das HR-KPI Cockpit zeigt Headcount, FTE, Fluktuation, Absenzen, GLZ-Saldi, Ferienkennzahlen und Datenqualitaet aus den bereitgestellten Rexx-/SAP-Dateien.</w:t>
       </w:r>
     </w:p>
-    <w:p/>
-    <w:p>
-      <w:pPr>
-        <w:pStyle w:val="Heading1"/>
-      </w:pPr>
-      <w:r>
-        <w:t>Dateien vorbereiten</w:t>
+    <w:p>
+      <w:r>
+        <w:t xml:space="preserve">Dateien vorbereiten</w:t>
       </w:r>
     </w:p>
     <w:p>
@@ -58,13 +47,9 @@
         <w:t xml:space="preserve">4. Vorhandene alte Dateien im Zielordner ersetzen, damit keine alten Stichtage geladen werden.</w:t>
       </w:r>
     </w:p>
-    <w:p/>
-    <w:p>
-      <w:pPr>
-        <w:pStyle w:val="Heading1"/>
-      </w:pPr>
-      <w:r>
-        <w:t>Cockpit laden</w:t>
+    <w:p>
+      <w:r>
+        <w:t xml:space="preserve">Cockpit laden</w:t>
       </w:r>
     </w:p>
     <w:p>
@@ -87,27 +72,74 @@
         <w:t xml:space="preserve">4. Laden klicken.</w:t>
       </w:r>
     </w:p>
-    <w:p/>
-    <w:p>
-      <w:pPr>
-        <w:pStyle w:val="Heading1"/>
-      </w:pPr>
-      <w:r>
-        <w:t>Datenstatus pruefen</w:t>
-      </w:r>
-    </w:p>
-    <w:p>
-      <w:r>
-        <w:t xml:space="preserve">Im Reiter Datenstatus pruefen, ob alle erwarteten Dateien gefunden wurden. Der Reiter zeigt Pfad, Status, Zeilenanzahl, Aenderungsdatum und Dateialter. Fehlende oder alte Dateien zuerst korrigieren.</w:t>
-      </w:r>
-    </w:p>
-    <w:p/>
-    <w:p>
-      <w:pPr>
-        <w:pStyle w:val="Heading1"/>
-      </w:pPr>
-      <w:r>
-        <w:t>Ampel und Vorperioden</w:t>
+    <w:p>
+      <w:r>
+        <w:t xml:space="preserve">Datenstatus pruefen</w:t>
+      </w:r>
+    </w:p>
+    <w:p>
+      <w:r>
+        <w:t xml:space="preserve">Im Reiter Datenstatus pruefen, ob alle erwarteten Dateien gefunden wurden. Der Reiter zeigt Pfad, Status, Zeilenanzahl, Aenderungsdatum, Dateialter und Frischebewertung. Fehlende oder alte Dateien zuerst korrigieren.</w:t>
+      </w:r>
+    </w:p>
+    <w:p>
+      <w:r>
+        <w:t xml:space="preserve">Neue 10 Punkte im Cockpit</w:t>
+      </w:r>
+    </w:p>
+    <w:p>
+      <w:r>
+        <w:t xml:space="preserve">1. Anleitung-Reiter: Ablauf, Datenordner, Datenschutz und erwartete Dateien sind direkt im Cockpit sichtbar.</w:t>
+      </w:r>
+    </w:p>
+    <w:p>
+      <w:r>
+        <w:t xml:space="preserve">2. Datenordner: Standard ist C:\temp, kann je Lauf angepasst und dauerhaft in appsettings.json unter HrKpi:DataFolder konfiguriert werden.</w:t>
+      </w:r>
+    </w:p>
+    <w:p>
+      <w:r>
+        <w:t xml:space="preserve">3. Dateistatus: Pfad, Zeilen, Aenderungsdatum, Alter und Frischebewertung zeigen, ob die Exportdateien belastbar sind.</w:t>
+      </w:r>
+    </w:p>
+    <w:p>
+      <w:r>
+        <w:t xml:space="preserve">4. Managementsicht: Personennamen werden fuer Fuehrungsberichte anonymisiert.</w:t>
+      </w:r>
+    </w:p>
+    <w:p>
+      <w:r>
+        <w:t xml:space="preserve">5. HR-Ampel: Fluktuation, Krankenquote, GLZ, Restferien und Datenqualitaet werden als Ampeln zusammengefasst.</w:t>
+      </w:r>
+    </w:p>
+    <w:p>
+      <w:r>
+        <w:t xml:space="preserve">6. Ampel-Filter: GLZ- und Restferien-Ampeln koennen gefiltert werden.</w:t>
+      </w:r>
+    </w:p>
+    <w:p>
+      <w:r>
+        <w:t xml:space="preserve">7. Periodenvergleich: wichtige Kennzahlen werden mit Vorperioden/Vorjahr verglichen, soweit die Daten vorhanden sind.</w:t>
+      </w:r>
+    </w:p>
+    <w:p>
+      <w:r>
+        <w:t xml:space="preserve">8. Datenqualitaet: fehlende Dateien, alte Dateien und auffaellige Werte werden als Hinweise angezeigt.</w:t>
+      </w:r>
+    </w:p>
+    <w:p>
+      <w:r>
+        <w:t xml:space="preserve">9. Austritte: Austritte werden nach Austrittsart und Organisation gruppiert.</w:t>
+      </w:r>
+    </w:p>
+    <w:p>
+      <w:r>
+        <w:t xml:space="preserve">10. Absenzen und PDF: Absenzen werden nach Organisation und als Top-Absenzen angezeigt; Drucken/PDF erstellt eine weitergebbare Ansicht.</w:t>
+      </w:r>
+    </w:p>
+    <w:p>
+      <w:r>
+        <w:t xml:space="preserve">Ampel und Vorperioden</w:t>
       </w:r>
     </w:p>
     <w:p>
@@ -115,13 +147,9 @@
         <w:t xml:space="preserve">Der Reiter Ampel fasst Fluktuation, Krankenquote, GLZ, Restferien und Datenqualitaet zusammen. Vorperiodenkennzahlen zeigen Vergleichswerte zum Vorjahr, soweit Austrittsdaten vorhanden sind.</w:t>
       </w:r>
     </w:p>
-    <w:p/>
-    <w:p>
-      <w:pPr>
-        <w:pStyle w:val="Heading1"/>
-      </w:pPr>
-      <w:r>
-        <w:t>Managementsicht</w:t>
+    <w:p>
+      <w:r>
+        <w:t xml:space="preserve">Managementsicht</w:t>
       </w:r>
     </w:p>
     <w:p>
@@ -129,13 +157,9 @@
         <w:t xml:space="preserve">Die Managementsicht anonymisiert Personennamen in Detailtabellen. Fuer Managementberichte diese Sicht aktivieren und danach Drucken/PDF verwenden.</w:t>
       </w:r>
     </w:p>
-    <w:p/>
-    <w:p>
-      <w:pPr>
-        <w:pStyle w:val="Heading1"/>
-      </w:pPr>
-      <w:r>
-        <w:t>Datenschutz</w:t>
+    <w:p>
+      <w:r>
+        <w:t xml:space="preserve">Datenschutz</w:t>
       </w:r>
     </w:p>
     <w:p>
@@ -143,13 +167,9 @@
         <w:t xml:space="preserve">HR-Dateien enthalten Personendaten. Dateien nicht per E-Mail weiterleiten, nicht in ungeschuetzten Ordnern liegen lassen und nur berechtigten Personen zeigen.</w:t>
       </w:r>
     </w:p>
-    <w:p/>
-    <w:p>
-      <w:pPr>
-        <w:pStyle w:val="Heading1"/>
-      </w:pPr>
-      <w:r>
-        <w:t>Typische Fehler</w:t>
+    <w:p>
+      <w:r>
+        <w:t xml:space="preserve">Typische Fehler</w:t>
       </w:r>
     </w:p>
     <w:p>
@@ -174,7 +194,7 @@
     </w:p>
     <w:sectPr>
       <w:pgSz w:w="11906" w:h="16838"/>
-      <w:pgMar w:top="1440" w:right="1440" w:bottom="1440" w:left="1440"/>
+      <w:pgMar w:top="1440" w:right="1440" w:bottom="1440" w:left="1440" w:header="708" w:footer="708" w:gutter="0"/>
     </w:sectPr>
   </w:body>
 </w:document>

</xml_diff>